<commit_message>
docs: update PPTX and Final Report attribution from IBM to Huvalon
- 13_Presentation.pptx: slide 1 + slide 12 footers updated
  IBM Student Project -> Huvalon Internship | Data Analysis & Automation
  Sayu-V | Yenepoya University | March 2026
  -> Sayooj Vandichal | Yenepoya University BCA | Mar-May 2026
- 12_Final_Report.docx: cover table, abstract, and running footer updated
  Author: Sayu (Sayu-V) -> Sayooj Vandichal (Sayu-V)
  Project: IBM Student Project 2023-2026 Batch
  -> Huvalon Consultancy Internship (Mar-May 2026)

Co-Authored-By: Claude Sonnet 4.6 <noreply@anthropic.com>
</commit_message>
<xml_diff>
--- a/docs/12_Final_Report.docx
+++ b/docs/12_Final_Report.docx
@@ -183,7 +183,7 @@
                 <w:sz w:val="20"/>
                 <w:szCs w:val="20"/>
               </w:rPr>
-              <w:t xml:space="preserve">Sayu (Sayu-V)</w:t>
+              <w:t xml:space="preserve">Sayooj Vandichal (Sayu-V)</w:t>
             </w:r>
           </w:p>
         </w:tc>
@@ -307,7 +307,7 @@
                 <w:sz w:val="20"/>
                 <w:szCs w:val="20"/>
               </w:rPr>
-              <w:t xml:space="preserve">IBM Student Project — 2023–2026 Batch</w:t>
+              <w:t xml:space="preserve">Huvalon Consultancy Internship — Data Analysis &amp; Automation (Mar–May 2026)</w:t>
             </w:r>
           </w:p>
         </w:tc>
@@ -923,7 +923,7 @@
           <w:sz w:val="22"/>
           <w:szCs w:val="22"/>
         </w:rPr>
-        <w:t xml:space="preserve">The Expense Tracker is a production-grade, full-stack personal finance management system built as an IBM Student Project at Yenepoya University. Developed over a structured 7-milestone roadmap spanning 2023–2026, the application enables individuals to track income and expenditure, set budgets and savings goals, and gain intelligent financial insights — all within a responsive, offline-capable Progressive Web App.</w:t>
+        <w:t xml:space="preserve">The Expense Tracker is a production-grade, full-stack personal finance management system built as the capstone project for a Huvalon Consultancy internship (Data Analysis &amp; Automation, March–May 2026) at Yenepoya University. Developed over a structured 7-milestone roadmap, the application enables individuals to track income and expenditure, set budgets and savings goals, and gain intelligent financial insights — all within a responsive, offline-capable Progressive Web App.</w:t>
       </w:r>
     </w:p>
     <w:tbl>
@@ -18988,7 +18988,7 @@
           <w:sz w:val="18"/>
           <w:szCs w:val="18"/>
         </w:rPr>
-        <w:t xml:space="preserve">Sayu-V  ·  Yenepoya University  ·  IBM Student Project  ·  March 2026</w:t>
+        <w:t xml:space="preserve">Sayooj Vandichal  ·  Yenepoya University  ·  Huvalon Internship  ·  Mar–May 2026</w:t>
       </w:r>
     </w:p>
     <w:sectPr>

</xml_diff>